<commit_message>
Replace all 11 covers with the owner's photographic artwork
- Covers placed full-bleed on page 1 of both DOCX and PDF at exactly A4
  (210 x 297 mm), no page margin, no footer over the artwork
- DOCX: the cover gets its own zero-margin section; the body section keeps
  the original margins, footer and page numbering
- Verified per product after the swap: PDF and DOCX page counts identical to
  the recorded builds, one image on page 1, copyright page intact on page 2,
  Telegram link annotations unchanged, files open
- Cover limitation line updated in all 11 QA reports and the master report
- Delivery ZIP rebuilt (34 files, deliverables only)

Co-Authored-By: Claude Opus 5 <noreply@anthropic.com>
Claude-Session: https://claude.ai/code/session_014ShcYMRCpouJgPiPGmmrKX
</commit_message>
<xml_diff>
--- a/AI_Arabic_Product_Library/01_Claude_Guide/Claude_Guide_Arabic_Final.docx
+++ b/AI_Arabic_Product_Library/01_Claude_Guide/Claude_Guide_Arabic_Final.docx
@@ -4,203 +4,55 @@
   <w:body>
     <w:p>
       <w:pPr>
-        <w:pStyle w:val="APLBody"/>
-        <w:widowControl w:val="1"/>
-        <w:bidi w:val="1"/>
-        <w:spacing w:after="1800"/>
-      </w:pPr>
-    </w:p>
-    <w:p>
-      <w:pPr>
-        <w:pStyle w:val="APLBody"/>
-        <w:widowControl w:val="1"/>
-        <w:bidi w:val="1"/>
-      </w:pPr>
-      <w:r>
-        <w:rPr>
-          <w:rFonts w:ascii="IBM Plex Sans Arabic" w:hAnsi="IBM Plex Sans Arabic" w:cs="IBM Plex Sans Arabic" w:eastAsia="IBM Plex Sans Arabic"/>
-          <w:b/>
-          <w:bCs w:val="1"/>
-          <w:color w:val="C2683A"/>
-          <w:sz w:val="22"/>
-          <w:szCs w:val="22"/>
-          <w:rtl w:val="1"/>
-          <w:cs w:val="1"/>
-        </w:rPr>
-        <w:t>دليل عملي بالعربية</w:t>
-      </w:r>
-    </w:p>
-    <w:p>
-      <w:pPr>
-        <w:pStyle w:val="APLTitle"/>
-        <w:widowControl w:val="1"/>
-        <w:bidi w:val="1"/>
-      </w:pPr>
-      <w:r>
-        <w:rPr>
-          <w:rFonts w:ascii="IBM Plex Sans Arabic" w:hAnsi="IBM Plex Sans Arabic" w:cs="IBM Plex Sans Arabic" w:eastAsia="IBM Plex Sans Arabic"/>
-          <w:b w:val="0"/>
-          <w:rtl w:val="1"/>
-          <w:cs w:val="1"/>
-        </w:rPr>
-        <w:t xml:space="preserve">دليل </w:t>
-      </w:r>
-      <w:r>
-        <w:rPr>
-          <w:rFonts w:ascii="IBM Plex Sans Arabic" w:hAnsi="IBM Plex Sans Arabic" w:cs="IBM Plex Sans Arabic" w:eastAsia="IBM Plex Sans Arabic"/>
-          <w:b w:val="0"/>
-          <w:rtl w:val="0"/>
-        </w:rPr>
-        <w:t xml:space="preserve">Claude </w:t>
-      </w:r>
-      <w:r>
-        <w:rPr>
-          <w:rFonts w:ascii="IBM Plex Sans Arabic" w:hAnsi="IBM Plex Sans Arabic" w:cs="IBM Plex Sans Arabic" w:eastAsia="IBM Plex Sans Arabic"/>
-          <w:b w:val="0"/>
-          <w:rtl w:val="1"/>
-          <w:cs w:val="1"/>
-        </w:rPr>
-        <w:t>العملي</w:t>
-      </w:r>
-    </w:p>
-    <w:p>
-      <w:pPr>
-        <w:pStyle w:val="APLSubtitle"/>
-        <w:widowControl w:val="1"/>
-        <w:bidi w:val="1"/>
-      </w:pPr>
-      <w:r>
-        <w:rPr>
-          <w:rFonts w:ascii="IBM Plex Sans Arabic" w:hAnsi="IBM Plex Sans Arabic" w:cs="IBM Plex Sans Arabic" w:eastAsia="IBM Plex Sans Arabic"/>
-          <w:b w:val="0"/>
-          <w:rtl w:val="1"/>
-          <w:cs w:val="1"/>
-        </w:rPr>
-        <w:t xml:space="preserve">من أول محادثة إلى البحث والتحليل والملفات والمشاريع والعمل الاحترافي بأحدث ميزات </w:t>
-      </w:r>
-      <w:r>
-        <w:rPr>
-          <w:rFonts w:ascii="IBM Plex Sans Arabic" w:hAnsi="IBM Plex Sans Arabic" w:cs="IBM Plex Sans Arabic" w:eastAsia="IBM Plex Sans Arabic"/>
-          <w:b w:val="0"/>
-          <w:rtl w:val="0"/>
-        </w:rPr>
-        <w:t>Claude</w:t>
-      </w:r>
-    </w:p>
-    <w:p>
-      <w:pPr>
-        <w:pStyle w:val="APLBody"/>
-        <w:widowControl w:val="1"/>
-        <w:bidi w:val="1"/>
-        <w:spacing w:after="480"/>
-      </w:pPr>
-    </w:p>
-    <w:p>
-      <w:pPr>
-        <w:pStyle w:val="APLBody"/>
-        <w:widowControl w:val="1"/>
-        <w:bidi w:val="1"/>
-      </w:pPr>
-      <w:r>
-        <w:rPr>
-          <w:rFonts w:ascii="IBM Plex Sans Arabic" w:hAnsi="IBM Plex Sans Arabic" w:cs="IBM Plex Sans Arabic" w:eastAsia="IBM Plex Sans Arabic"/>
-          <w:b w:val="0"/>
-          <w:color w:val="6E665A"/>
-          <w:sz w:val="20"/>
-          <w:szCs w:val="20"/>
-          <w:rtl w:val="0"/>
-        </w:rPr>
-        <w:t xml:space="preserve">14 </w:t>
-      </w:r>
-      <w:r>
-        <w:rPr>
-          <w:rFonts w:ascii="IBM Plex Sans Arabic" w:hAnsi="IBM Plex Sans Arabic" w:cs="IBM Plex Sans Arabic" w:eastAsia="IBM Plex Sans Arabic"/>
-          <w:b w:val="0"/>
-          <w:color w:val="6E665A"/>
-          <w:sz w:val="20"/>
-          <w:szCs w:val="20"/>
-          <w:rtl w:val="1"/>
-          <w:cs w:val="1"/>
-        </w:rPr>
-        <w:t xml:space="preserve">فصلا · أمثلة تطبيقية · محدث في سبتمبر </w:t>
-      </w:r>
-      <w:r>
-        <w:rPr>
-          <w:rFonts w:ascii="IBM Plex Sans Arabic" w:hAnsi="IBM Plex Sans Arabic" w:cs="IBM Plex Sans Arabic" w:eastAsia="IBM Plex Sans Arabic"/>
-          <w:b w:val="0"/>
-          <w:color w:val="6E665A"/>
-          <w:sz w:val="20"/>
-          <w:szCs w:val="20"/>
-          <w:rtl w:val="0"/>
-        </w:rPr>
-        <w:t>2026</w:t>
-      </w:r>
-    </w:p>
-    <w:p>
-      <w:pPr>
-        <w:pStyle w:val="APLBody"/>
-        <w:widowControl w:val="1"/>
-        <w:bidi w:val="1"/>
-        <w:spacing w:after="800"/>
-      </w:pPr>
-    </w:p>
-    <w:p>
-      <w:pPr>
-        <w:pStyle w:val="APLH3"/>
-        <w:widowControl w:val="1"/>
-        <w:bidi w:val="1"/>
-      </w:pPr>
-      <w:r>
-        <w:rPr>
-          <w:rFonts w:ascii="IBM Plex Sans Arabic" w:hAnsi="IBM Plex Sans Arabic" w:cs="IBM Plex Sans Arabic" w:eastAsia="IBM Plex Sans Arabic"/>
-          <w:b w:val="0"/>
-          <w:color w:val="C2683A"/>
-          <w:rtl w:val="0"/>
-        </w:rPr>
-        <w:t>CLAUDE</w:t>
-      </w:r>
-    </w:p>
-    <w:p>
-      <w:pPr>
-        <w:pStyle w:val="APLBody"/>
-        <w:widowControl w:val="1"/>
-        <w:bidi w:val="1"/>
-      </w:pPr>
-      <w:r>
-        <w:rPr>
-          <w:rFonts w:ascii="IBM Plex Sans Arabic" w:hAnsi="IBM Plex Sans Arabic" w:cs="IBM Plex Sans Arabic" w:eastAsia="IBM Plex Sans Arabic"/>
-          <w:b/>
-          <w:bCs w:val="1"/>
-          <w:sz w:val="20"/>
-          <w:szCs w:val="20"/>
-          <w:rtl w:val="1"/>
-          <w:cs w:val="1"/>
-        </w:rPr>
-        <w:t>برومبتات عربية</w:t>
-      </w:r>
-    </w:p>
-    <w:p>
-      <w:pPr>
-        <w:pStyle w:val="APLBody"/>
-        <w:widowControl w:val="1"/>
-        <w:bidi w:val="1"/>
-      </w:pPr>
-      <w:r>
-        <w:rPr>
-          <w:rFonts w:ascii="IBM Plex Sans Arabic" w:hAnsi="IBM Plex Sans Arabic" w:cs="IBM Plex Sans Arabic" w:eastAsia="IBM Plex Sans Arabic"/>
-          <w:b w:val="0"/>
-          <w:color w:val="6E665A"/>
-          <w:sz w:val="18"/>
-          <w:szCs w:val="18"/>
-          <w:rtl w:val="0"/>
-        </w:rPr>
-        <w:t>t.me/PromptsArabic</w:t>
-      </w:r>
-    </w:p>
-    <w:p>
-      <w:r>
-        <w:br w:type="page"/>
-      </w:r>
+        <w:spacing w:before="0" w:after="0" w:line="240" w:lineRule="auto"/>
+        <w:jc w:val="center"/>
+      </w:pPr>
+      <w:r>
+        <w:drawing>
+          <wp:inline xmlns:a="http://schemas.openxmlformats.org/drawingml/2006/main" xmlns:pic="http://schemas.openxmlformats.org/drawingml/2006/picture">
+            <wp:extent cx="7560000" cy="10692000"/>
+            <wp:docPr id="1" name="Picture 1"/>
+            <wp:cNvGraphicFramePr>
+              <a:graphicFrameLocks noChangeAspect="1"/>
+            </wp:cNvGraphicFramePr>
+            <a:graphic>
+              <a:graphicData uri="http://schemas.openxmlformats.org/drawingml/2006/picture">
+                <pic:pic>
+                  <pic:nvPicPr>
+                    <pic:cNvPr id="0" name="01_claude_guide.jpg"/>
+                    <pic:cNvPicPr/>
+                  </pic:nvPicPr>
+                  <pic:blipFill>
+                    <a:blip r:embed="rId10"/>
+                    <a:stretch>
+                      <a:fillRect/>
+                    </a:stretch>
+                  </pic:blipFill>
+                  <pic:spPr>
+                    <a:xfrm>
+                      <a:off x="0" y="0"/>
+                      <a:ext cx="7560000" cy="10692000"/>
+                    </a:xfrm>
+                    <a:prstGeom prst="rect"/>
+                  </pic:spPr>
+                </pic:pic>
+              </a:graphicData>
+            </a:graphic>
+          </wp:inline>
+        </w:drawing>
+      </w:r>
+    </w:p>
+    <w:p>
+      <w:pPr>
+        <w:sectPr>
+          <w:footerReference w:type="default" r:id="rId9"/>
+          <w:pgSz w:w="11906" w:h="16838"/>
+          <w:pgMar w:top="0" w:right="0" w:bottom="0" w:left="0" w:header="720" w:footer="720" w:gutter="0"/>
+          <w:cols w:space="720"/>
+          <w:bidi w:val="1"/>
+          <w:docGrid w:linePitch="360"/>
+        </w:sectPr>
+      </w:pPr>
     </w:p>
     <w:p>
       <w:pPr>
@@ -19731,7 +19583,7 @@
       </w:r>
     </w:p>
     <w:sectPr>
-      <w:footerReference w:type="default" r:id="rId9"/>
+      <w:footerReference w:type="default" r:id="rId11"/>
       <w:pgSz w:w="11906" w:h="16838"/>
       <w:pgMar w:top="1134" w:right="1020" w:bottom="1020" w:left="1020" w:header="720" w:footer="720" w:gutter="0"/>
       <w:cols w:space="720"/>
@@ -19743,6 +19595,12 @@
 </file>
 
 <file path=word/footer1.xml><?xml version="1.0" encoding="utf-8"?>
+<w:ftr xmlns:m="http://schemas.openxmlformats.org/officeDocument/2006/math" xmlns:mc="http://schemas.openxmlformats.org/markup-compatibility/2006" xmlns:mo="http://schemas.microsoft.com/office/mac/office/2008/main" xmlns:mv="urn:schemas-microsoft-com:mac:vml" xmlns:o="urn:schemas-microsoft-com:office:office" xmlns:r="http://schemas.openxmlformats.org/officeDocument/2006/relationships" xmlns:v="urn:schemas-microsoft-com:vml" xmlns:w10="urn:schemas-microsoft-com:office:word" xmlns:w14="http://schemas.microsoft.com/office/word/2010/wordml" xmlns:w="http://schemas.openxmlformats.org/wordprocessingml/2006/main" xmlns:wne="http://schemas.microsoft.com/office/word/2006/wordml" xmlns:wp14="http://schemas.microsoft.com/office/word/2010/wordprocessingDrawing" xmlns:wp="http://schemas.openxmlformats.org/drawingml/2006/wordprocessingDrawing" xmlns:wpc="http://schemas.microsoft.com/office/word/2010/wordprocessingCanvas" xmlns:wpg="http://schemas.microsoft.com/office/word/2010/wordprocessingGroup" xmlns:wpi="http://schemas.microsoft.com/office/word/2010/wordprocessingInk" xmlns:wps="http://schemas.microsoft.com/office/word/2010/wordprocessingShape" mc:Ignorable="w14 wp14">
+  <w:p/>
+</w:ftr>
+</file>
+
+<file path=word/footer2.xml><?xml version="1.0" encoding="utf-8"?>
 <w:ftr xmlns:m="http://schemas.openxmlformats.org/officeDocument/2006/math" xmlns:mc="http://schemas.openxmlformats.org/markup-compatibility/2006" xmlns:mo="http://schemas.microsoft.com/office/mac/office/2008/main" xmlns:mv="urn:schemas-microsoft-com:mac:vml" xmlns:o="urn:schemas-microsoft-com:office:office" xmlns:r="http://schemas.openxmlformats.org/officeDocument/2006/relationships" xmlns:v="urn:schemas-microsoft-com:vml" xmlns:w10="urn:schemas-microsoft-com:office:word" xmlns:w14="http://schemas.microsoft.com/office/word/2010/wordml" xmlns:w="http://schemas.openxmlformats.org/wordprocessingml/2006/main" xmlns:wne="http://schemas.microsoft.com/office/word/2006/wordml" xmlns:wp14="http://schemas.microsoft.com/office/word/2010/wordprocessingDrawing" xmlns:wp="http://schemas.openxmlformats.org/drawingml/2006/wordprocessingDrawing" xmlns:wpc="http://schemas.microsoft.com/office/word/2010/wordprocessingCanvas" xmlns:wpg="http://schemas.microsoft.com/office/word/2010/wordprocessingGroup" xmlns:wpi="http://schemas.microsoft.com/office/word/2010/wordprocessingInk" xmlns:wps="http://schemas.microsoft.com/office/word/2010/wordprocessingShape" mc:Ignorable="w14 wp14">
   <w:p>
     <w:pPr>

</xml_diff>